<commit_message>
Cartas: logo reducido como membrete; Induveca general y dirigida a Daisy Medina
- data/logo_etc.png: reducido 527KB -> 168KB (membrete más liviano); .docx pasan de ~528KB a ~205KB
- Carta_Induveca: pedido GENERAL (gama de embutidos/cárnicos, sin menú de misiones), dirigida a Sra. Daisy Medina, fecha de hoy; lista para imprimir/firmar/sellar
- Modelos empresa/personal regenerados con el logo incrustado

Co-Authored-By: Claude Opus 4.8 <noreply@anthropic.com>
Claude-Session: https://claude.ai/code/session_01MGAmtqoRwx6cYP4Ki2adap
</commit_message>
<xml_diff>
--- a/Carta_Induveca_ETC88.docx
+++ b/Carta_Induveca_ETC88.docx
@@ -9,7 +9,7 @@
       <w:r>
         <w:drawing>
           <wp:inline xmlns:a="http://schemas.openxmlformats.org/drawingml/2006/main" xmlns:pic="http://schemas.openxmlformats.org/drawingml/2006/picture">
-            <wp:extent cx="1371600" cy="743567"/>
+            <wp:extent cx="1371600" cy="744093"/>
             <wp:docPr id="1" name="Picture 1"/>
             <wp:cNvGraphicFramePr>
               <a:graphicFrameLocks noChangeAspect="1"/>
@@ -30,7 +30,7 @@
                   <pic:spPr>
                     <a:xfrm>
                       <a:off x="0" y="0"/>
-                      <a:ext cx="1371600" cy="743567"/>
+                      <a:ext cx="1371600" cy="744093"/>
                     </a:xfrm>
                     <a:prstGeom prst="rect"/>
                   </pic:spPr>
@@ -101,7 +101,7 @@
           <w:b w:val="0"/>
           <w:i w:val="0"/>
         </w:rPr>
-        <w:t>Señores</w:t>
+        <w:t>Señora</w:t>
       </w:r>
     </w:p>
     <w:p>
@@ -110,7 +110,7 @@
           <w:b w:val="0"/>
           <w:i w:val="0"/>
         </w:rPr>
-        <w:t>INDUVECA (Grupo SID)</w:t>
+        <w:t>Daisy Medina</w:t>
       </w:r>
     </w:p>
     <w:p>
@@ -119,7 +119,7 @@
           <w:b w:val="0"/>
           <w:i w:val="0"/>
         </w:rPr>
-        <w:t>At'n.: Departamento de Responsabilidad Social</w:t>
+        <w:t>Induveca (Grupo SID)</w:t>
       </w:r>
     </w:p>
     <w:p>
@@ -165,230 +165,16 @@
           <w:b w:val="0"/>
           <w:i w:val="0"/>
         </w:rPr>
-        <w:t>Conocedores del compromiso social de Grupo SID con las familias dominicanas, apelamos a la generosidad de Induveca solicitando su colaboración con embutidos y productos cárnicos de su línea —que ya forman parte de nuestro presupuesto de cocina— para alimentar a los jóvenes durante el retiro, tales como:</w:t>
+        <w:t>Conocedores del compromiso social de Grupo SID con las familias dominicanas, apelamos a la generosidad de Induveca solicitando su colaboración, según su disponibilidad, con productos de su línea de embutidos y cárnicos (jamón, salami, salchichón, mortadela, salchichas, entre otros) para la alimentación de los jóvenes durante el fin de semana del retiro.</w:t>
       </w:r>
     </w:p>
-    <w:tbl>
-      <w:tblPr>
-        <w:tblStyle w:val="LightGrid-Accent1"/>
-        <w:tblW w:type="auto" w:w="0"/>
-        <w:tblLook w:firstColumn="1" w:firstRow="1" w:lastColumn="0" w:lastRow="0" w:noHBand="0" w:noVBand="1" w:val="04A0"/>
-      </w:tblPr>
-      <w:tblGrid>
-        <w:gridCol w:w="2880"/>
-        <w:gridCol w:w="2880"/>
-        <w:gridCol w:w="2880"/>
-      </w:tblGrid>
-      <w:tr>
-        <w:tc>
-          <w:tcPr>
-            <w:tcW w:type="dxa" w:w="2880"/>
-          </w:tcPr>
-          <w:p>
-            <w:r>
-              <w:rPr>
-                <w:b/>
-              </w:rPr>
-              <w:t>Cantidad (aprox.)</w:t>
-            </w:r>
-          </w:p>
-        </w:tc>
-        <w:tc>
-          <w:tcPr>
-            <w:tcW w:type="dxa" w:w="2880"/>
-          </w:tcPr>
-          <w:p>
-            <w:r>
-              <w:rPr>
-                <w:b/>
-              </w:rPr>
-              <w:t>Unidad</w:t>
-            </w:r>
-          </w:p>
-        </w:tc>
-        <w:tc>
-          <w:tcPr>
-            <w:tcW w:type="dxa" w:w="2880"/>
-          </w:tcPr>
-          <w:p>
-            <w:r>
-              <w:rPr>
-                <w:b/>
-              </w:rPr>
-              <w:t>Producto Induveca</w:t>
-            </w:r>
-          </w:p>
-        </w:tc>
-      </w:tr>
-      <w:tr>
-        <w:tc>
-          <w:tcPr>
-            <w:tcW w:type="dxa" w:w="2880"/>
-          </w:tcPr>
-          <w:p>
-            <w:r>
-              <w:t>12</w:t>
-            </w:r>
-          </w:p>
-        </w:tc>
-        <w:tc>
-          <w:tcPr>
-            <w:tcW w:type="dxa" w:w="2880"/>
-          </w:tcPr>
-          <w:p>
-            <w:r>
-              <w:t>barras (3 lb)</w:t>
-            </w:r>
-          </w:p>
-        </w:tc>
-        <w:tc>
-          <w:tcPr>
-            <w:tcW w:type="dxa" w:w="2880"/>
-          </w:tcPr>
-          <w:p>
-            <w:r>
-              <w:t>Salami Super Especial</w:t>
-            </w:r>
-          </w:p>
-        </w:tc>
-      </w:tr>
-      <w:tr>
-        <w:tc>
-          <w:tcPr>
-            <w:tcW w:type="dxa" w:w="2880"/>
-          </w:tcPr>
-          <w:p>
-            <w:r>
-              <w:t>12</w:t>
-            </w:r>
-          </w:p>
-        </w:tc>
-        <w:tc>
-          <w:tcPr>
-            <w:tcW w:type="dxa" w:w="2880"/>
-          </w:tcPr>
-          <w:p>
-            <w:r>
-              <w:t>libras</w:t>
-            </w:r>
-          </w:p>
-        </w:tc>
-        <w:tc>
-          <w:tcPr>
-            <w:tcW w:type="dxa" w:w="2880"/>
-          </w:tcPr>
-          <w:p>
-            <w:r>
-              <w:t>Jamón</w:t>
-            </w:r>
-          </w:p>
-        </w:tc>
-      </w:tr>
-      <w:tr>
-        <w:tc>
-          <w:tcPr>
-            <w:tcW w:type="dxa" w:w="2880"/>
-          </w:tcPr>
-          <w:p>
-            <w:r>
-              <w:t>8</w:t>
-            </w:r>
-          </w:p>
-        </w:tc>
-        <w:tc>
-          <w:tcPr>
-            <w:tcW w:type="dxa" w:w="2880"/>
-          </w:tcPr>
-          <w:p>
-            <w:r>
-              <w:t>libras</w:t>
-            </w:r>
-          </w:p>
-        </w:tc>
-        <w:tc>
-          <w:tcPr>
-            <w:tcW w:type="dxa" w:w="2880"/>
-          </w:tcPr>
-          <w:p>
-            <w:r>
-              <w:t>Salchichón</w:t>
-            </w:r>
-          </w:p>
-        </w:tc>
-      </w:tr>
-      <w:tr>
-        <w:tc>
-          <w:tcPr>
-            <w:tcW w:type="dxa" w:w="2880"/>
-          </w:tcPr>
-          <w:p>
-            <w:r>
-              <w:t>8</w:t>
-            </w:r>
-          </w:p>
-        </w:tc>
-        <w:tc>
-          <w:tcPr>
-            <w:tcW w:type="dxa" w:w="2880"/>
-          </w:tcPr>
-          <w:p>
-            <w:r>
-              <w:t>libras</w:t>
-            </w:r>
-          </w:p>
-        </w:tc>
-        <w:tc>
-          <w:tcPr>
-            <w:tcW w:type="dxa" w:w="2880"/>
-          </w:tcPr>
-          <w:p>
-            <w:r>
-              <w:t>Mortadela</w:t>
-            </w:r>
-          </w:p>
-        </w:tc>
-      </w:tr>
-      <w:tr>
-        <w:tc>
-          <w:tcPr>
-            <w:tcW w:type="dxa" w:w="2880"/>
-          </w:tcPr>
-          <w:p>
-            <w:r>
-              <w:t>6</w:t>
-            </w:r>
-          </w:p>
-        </w:tc>
-        <w:tc>
-          <w:tcPr>
-            <w:tcW w:type="dxa" w:w="2880"/>
-          </w:tcPr>
-          <w:p>
-            <w:r>
-              <w:t>paquetes</w:t>
-            </w:r>
-          </w:p>
-        </w:tc>
-        <w:tc>
-          <w:tcPr>
-            <w:tcW w:type="dxa" w:w="2880"/>
-          </w:tcPr>
-          <w:p>
-            <w:r>
-              <w:t>Salchichas</w:t>
-            </w:r>
-          </w:p>
-        </w:tc>
-      </w:tr>
-    </w:tbl>
-    <w:p/>
     <w:p>
       <w:r>
         <w:rPr>
           <w:b w:val="0"/>
           <w:i w:val="0"/>
         </w:rPr>
-        <w:t>Si dentro del Grupo SID fuera posible, también nos ayudaría muchísimo el aceite comestible (Crisol / Mazola) y la harina de MercaSID. Cualquier aporte, en producto o en efectivo, será de gran ayuda; por ser una asociación de fieles de la Diócesis de San Pedro de Macorís podemos emitir la constancia de su donación que requieran, y con gusto los incluimos en nuestra cadena de oración.</w:t>
+        <w:t>Si dentro del Grupo SID fuera posible, también nos ayudaría el aceite comestible (Crisol / Mazola) y la harina de MercaSID. Cualquier aporte, en producto o en efectivo, será de gran ayuda; por ser una asociación de fieles de la Diócesis de San Pedro de Macorís podemos emitir la constancia de su donación que requieran, y con gusto los incluimos en nuestra cadena de oración.</w:t>
       </w:r>
     </w:p>
     <w:p>

</xml_diff>